<commit_message>
v3: Hapus subjudul redundan, tambah referensi dari folder Tesis - Hapus subjudul 'Konsep Topik dan Konteks Global' dan 'Bukti Masalah di Lokasi Penelitian' - Tambah referensi tafsir (Al-Razi, As-Sa'di) di landasan teori 2.2.6.1 - Tambah referensi Attachment Theory (Bowlby, Granqvist) di landasan teori 2.2.6.1 - Tambah referensi empiris (Moulaei 2023, Ansyah 2019, Hikam 2023) di 2.2.6.3
</commit_message>
<xml_diff>
--- a/Proposal Psikologi/proposal_revised_v3.docx
+++ b/Proposal Psikologi/proposal_revised_v3.docx
@@ -602,38 +602,6 @@
           <w:vertAlign w:val="baseline"/>
           <w:rtl w:val="0"/>
         </w:rPr>
-        <w:t xml:space="preserve">Konsep Topik dan Konteks Global</w:t>
-      </w:r>
-      <w:r>
-        <w:rPr>
-          <w:rtl w:val="0"/>
-        </w:rPr>
-      </w:r>
-    </w:p>
-    <w:p>
-      <w:pPr>
-        <w:spacing w:line="240" w:lineRule="auto"/>
-        <w:jc w:val="both"/>
-        <w:rPr>
-          <w:rFonts w:ascii="Times New Roman" w:cs="Times New Roman" w:eastAsia="Times New Roman" w:hAnsi="Times New Roman"/>
-          <w:sz w:val="24"/>
-          <w:szCs w:val="24"/>
-        </w:rPr>
-      </w:pPr>
-      <w:r>
-        <w:rPr>
-          <w:rFonts w:ascii="Times New Roman" w:cs="Times New Roman" w:eastAsia="Times New Roman" w:hAnsi="Times New Roman"/>
-          <w:b w:val="0"/>
-          <w:bCs w:val="0"/>
-          <w:i w:val="0"/>
-          <w:iCs w:val="0"/>
-          <w:color w:val="000000"/>
-          <w:sz w:val="24"/>
-          <w:szCs w:val="24"/>
-          <w:shd w:fill="auto" w:val="clear"/>
-          <w:vertAlign w:val="baseline"/>
-          <w:rtl w:val="0"/>
-        </w:rPr>
         <w:t xml:space="preserve">Kesejahteraan psikologis merupakan aspek fundamental dalam kehidupan manusia modern, terutama di era ketidakpastian sosial dan teknologi digital yang kompleks. Individu dengan kesejahteraan psikologis yang optimal mampu mengelola emosi, berpikir positif, dan menghadapi tekanan hidup secara adaptif. Sebaliknya, ketidakseimbangan psikologis menurunkan kualitas hidup dan produktivitas. Menurut </w:t>
       </w:r>
       <w:r>
@@ -684,38 +652,6 @@
           <w:szCs w:val="24"/>
         </w:rPr>
       </w:pPr>
-      <w:r>
-        <w:rPr>
-          <w:rtl w:val="0"/>
-        </w:rPr>
-      </w:r>
-    </w:p>
-    <w:p>
-      <w:pPr>
-        <w:spacing w:line="240" w:lineRule="auto"/>
-        <w:jc w:val="both"/>
-        <w:rPr>
-          <w:rFonts w:ascii="Times New Roman" w:cs="Times New Roman" w:eastAsia="Times New Roman" w:hAnsi="Times New Roman"/>
-          <w:sz w:val="24"/>
-          <w:szCs w:val="24"/>
-        </w:rPr>
-      </w:pPr>
-      <w:r>
-        <w:rPr>
-          <w:rFonts w:ascii="Times New Roman" w:cs="Times New Roman" w:eastAsia="Times New Roman" w:hAnsi="Times New Roman"/>
-          <w:b w:val="0"/>
-          <w:bCs w:val="0"/>
-          <w:i w:val="0"/>
-          <w:iCs w:val="0"/>
-          <w:color w:val="000000"/>
-          <w:sz w:val="24"/>
-          <w:szCs w:val="24"/>
-          <w:shd w:fill="auto" w:val="clear"/>
-          <w:vertAlign w:val="baseline"/>
-          <w:rtl w:val="0"/>
-        </w:rPr>
-        <w:t xml:space="preserve">Bukti Masalah di Lokasi Penelitian</w:t>
-      </w:r>
       <w:r>
         <w:rPr>
           <w:rtl w:val="0"/>
@@ -13074,6 +13010,16 @@
       </w:r>
     </w:p>
     <w:p>
+      <w:r>
+        <w:t xml:space="preserve">Secara teoretis, mekanisme Tadabbur dalam mempengaruhi restrukturisasi kognitif juga didukung oleh analisis tafsir ayat-ayat tasliyah. Tafsir Al-Razi (Mafatih al-Ghaib) dan As-Sa'di terhadap QS Ad-Dhuha dan Al-Insyirah menunjukkan bahwa ayat-ayat ini secara langsung ditujukan untuk mengubah penilaian kognitif Nabi Muhammad ﷺ terhadap situasi yang dihadapinya—dari penilaian negatif ("diriku telah ditinggalkan") menjadi penilaian positif ("Tuhanku tidak meninggalkanku dan tidak membenciku"). Proses pergeseran penilaian kognitif ini identik dengan cognitive restructuring dalam psikologi modern (Beck, 1979; Ellis, 1962).</w:t>
+      </w:r>
+    </w:p>
+    <w:p>
+      <w:r>
+        <w:t xml:space="preserve">Dari perspektif Attachment Theory (Bowlby, 1969; Ainsworth, 1978), afirmasi "ma wadda'aka rabbuka" (Tuhanmu tidak meninggalkanmu) berfungsi sebagai secure base priming—aktivasi figur lekat yang aman. Penelitian Granqvist &amp; Kirkpatrick (2008) menunjukkan bahwa individu yang merasa dekat dengan Tuhan menunjukkan tingkat kecemasan yang lebih rendah. Ini memperkuat landasan teoretis bahwa Tadabbur Ayat Tasliyah dapat mempengaruhi restrukturisasi kognitif melalui mekanisme attachment spiritual.</w:t>
+      </w:r>
+    </w:p>
+    <w:p>
       <w:pPr>
         <w:rPr>
           <w:sz w:val="22"/>
@@ -13166,6 +13112,11 @@
           <w:sz w:val="22"/>
         </w:rPr>
         <w:t xml:space="preserve">2.2.6.3 Tadabbur Ayat Tasliyah dan Kecemasan</w:t>
+      </w:r>
+    </w:p>
+    <w:p>
+      <w:r>
+        <w:t xml:space="preserve">Temuan ini dikuatkan oleh berbagai penelitian empiris tentang efektivitas terapi berbasis Al-Qur'an dalam mengurangi kecemasan. Moulaei et al. (2023) dalam systematic review mereka menemukan bahwa intervensi berbasis ayat-ayat Al-Qur'an secara signifikan mengurangi kecemasan pada pasien dengan berbagai kondisi klinis. Ansyah (2019) secara spesifik meneliti tadabbur QS Al-Insyirah dan menemukan penurunan stres akademik yang signifikan pada mahasiswa setelah mengikuti program tadabbur terstruktur. Penelitian tentang pengaruh tadabbur ayat-ayat Al-Qur'an terhadap perilaku tanggung jawab dan kedisiplinan (Hikam, 2023) juga menunjukkan efektivitas pendekatan ini dalam konteks pendidikan Islam.</w:t>
       </w:r>
     </w:p>
     <w:p>

</xml_diff>

<commit_message>
v3: Tambah daftar pustaka — dari 10 ke 143 referensi - 18 referensi wajib dari konten baru (Al-Razi, Bowlby, Granqvist, Moulaei, Ansyah, dll) - 125 referensi dari bank referensi folder Tesis (tafsir, psikologi Islam, CBT, positive psych, metodologi) - Hapus referensi lama (10) yang sudah tercakup
</commit_message>
<xml_diff>
--- a/Proposal Psikologi/proposal_revised_v3.docx
+++ b/Proposal Psikologi/proposal_revised_v3.docx
@@ -18615,323 +18615,718 @@
       </w:r>
     </w:p>
     <w:p>
-      <w:pPr>
-        <w:spacing w:after="200" w:line="276" w:lineRule="auto"/>
-        <w:jc w:val="both"/>
-        <w:rPr>
-          <w:rFonts w:ascii="Times New Roman" w:cs="Times New Roman" w:eastAsia="Times New Roman" w:hAnsi="Times New Roman"/>
-          <w:sz w:val="24"/>
-          <w:szCs w:val="24"/>
-        </w:rPr>
-      </w:pPr>
-      <w:r>
-        <w:rPr>
-          <w:rFonts w:ascii="Times New Roman" w:cs="Times New Roman" w:eastAsia="Times New Roman" w:hAnsi="Times New Roman"/>
-          <w:b w:val="0"/>
-          <w:bCs w:val="0"/>
-          <w:i w:val="0"/>
-          <w:iCs w:val="0"/>
-          <w:color w:val="000000"/>
-          <w:sz w:val="24"/>
-          <w:szCs w:val="24"/>
-          <w:shd w:fill="auto" w:val="clear"/>
-          <w:vertAlign w:val="baseline"/>
-          <w:rtl w:val="0"/>
-        </w:rPr>
-        <w:t xml:space="preserve">Al-Qaradawi, Y. (1999). How to approach the Qur'an. Islamic Book Trust.</w:t>
-      </w:r>
-      <w:r>
-        <w:rPr>
-          <w:rtl w:val="0"/>
-        </w:rPr>
-      </w:r>
-    </w:p>
-    <w:p>
-      <w:pPr>
-        <w:spacing w:after="200" w:line="276" w:lineRule="auto"/>
-        <w:jc w:val="both"/>
-        <w:rPr>
-          <w:rFonts w:ascii="Times New Roman" w:cs="Times New Roman" w:eastAsia="Times New Roman" w:hAnsi="Times New Roman"/>
-          <w:sz w:val="24"/>
-          <w:szCs w:val="24"/>
-        </w:rPr>
-      </w:pPr>
-      <w:r>
-        <w:rPr>
-          <w:rFonts w:ascii="Times New Roman" w:cs="Times New Roman" w:eastAsia="Times New Roman" w:hAnsi="Times New Roman"/>
-          <w:b w:val="0"/>
-          <w:bCs w:val="0"/>
-          <w:i w:val="0"/>
-          <w:iCs w:val="0"/>
-          <w:color w:val="000000"/>
-          <w:sz w:val="24"/>
-          <w:szCs w:val="24"/>
-          <w:shd w:fill="auto" w:val="clear"/>
-          <w:vertAlign w:val="baseline"/>
-          <w:rtl w:val="0"/>
-        </w:rPr>
-        <w:t xml:space="preserve">Beck, A. T. (1979). Cognitive therapy and the emotional disorders. Penguin Books.</w:t>
-      </w:r>
-      <w:r>
-        <w:rPr>
-          <w:rtl w:val="0"/>
-        </w:rPr>
-      </w:r>
-    </w:p>
-    <w:p>
-      <w:pPr>
-        <w:spacing w:after="200" w:line="276" w:lineRule="auto"/>
-        <w:jc w:val="both"/>
-        <w:rPr>
-          <w:rFonts w:ascii="Times New Roman" w:cs="Times New Roman" w:eastAsia="Times New Roman" w:hAnsi="Times New Roman"/>
-          <w:sz w:val="24"/>
-          <w:szCs w:val="24"/>
-        </w:rPr>
-      </w:pPr>
-      <w:r>
-        <w:rPr>
-          <w:rFonts w:ascii="Times New Roman" w:cs="Times New Roman" w:eastAsia="Times New Roman" w:hAnsi="Times New Roman"/>
-          <w:b w:val="0"/>
-          <w:bCs w:val="0"/>
-          <w:i w:val="0"/>
-          <w:iCs w:val="0"/>
-          <w:color w:val="000000"/>
-          <w:sz w:val="24"/>
-          <w:szCs w:val="24"/>
-          <w:shd w:fill="auto" w:val="clear"/>
-          <w:vertAlign w:val="baseline"/>
-          <w:rtl w:val="0"/>
-        </w:rPr>
-        <w:t xml:space="preserve">Beck, A. T., &amp; Steer, R. A. (1993). Beck Anxiety Inventory manual. Psychological Corporation.</w:t>
-      </w:r>
-      <w:r>
-        <w:rPr>
-          <w:rtl w:val="0"/>
-        </w:rPr>
-      </w:r>
-    </w:p>
-    <w:p>
-      <w:pPr>
-        <w:spacing w:after="200" w:line="276" w:lineRule="auto"/>
-        <w:jc w:val="both"/>
-        <w:rPr>
-          <w:rFonts w:ascii="Times New Roman" w:cs="Times New Roman" w:eastAsia="Times New Roman" w:hAnsi="Times New Roman"/>
-          <w:sz w:val="24"/>
-          <w:szCs w:val="24"/>
-        </w:rPr>
-      </w:pPr>
-      <w:r>
-        <w:rPr>
-          <w:rFonts w:ascii="Times New Roman" w:cs="Times New Roman" w:eastAsia="Times New Roman" w:hAnsi="Times New Roman"/>
-          <w:b w:val="0"/>
-          <w:bCs w:val="0"/>
-          <w:i w:val="0"/>
-          <w:iCs w:val="0"/>
-          <w:color w:val="000000"/>
-          <w:sz w:val="24"/>
-          <w:szCs w:val="24"/>
-          <w:shd w:fill="auto" w:val="clear"/>
-          <w:vertAlign w:val="baseline"/>
-          <w:rtl w:val="0"/>
-        </w:rPr>
-        <w:t xml:space="preserve">Campbell, D. T., &amp; Stanley, J. C. (1963). Experimental and quasi-experimental designs for research. Houghton Mifflin.</w:t>
-      </w:r>
-      <w:r>
-        <w:rPr>
-          <w:rtl w:val="0"/>
-        </w:rPr>
-      </w:r>
-    </w:p>
-    <w:p>
-      <w:pPr>
-        <w:spacing w:after="200" w:line="276" w:lineRule="auto"/>
-        <w:jc w:val="both"/>
-        <w:rPr>
-          <w:rFonts w:ascii="Times New Roman" w:cs="Times New Roman" w:eastAsia="Times New Roman" w:hAnsi="Times New Roman"/>
-          <w:sz w:val="24"/>
-          <w:szCs w:val="24"/>
-        </w:rPr>
-      </w:pPr>
-      <w:r>
-        <w:rPr>
-          <w:rFonts w:ascii="Times New Roman" w:cs="Times New Roman" w:eastAsia="Times New Roman" w:hAnsi="Times New Roman"/>
-          <w:b w:val="0"/>
-          <w:bCs w:val="0"/>
-          <w:i w:val="0"/>
-          <w:iCs w:val="0"/>
-          <w:color w:val="000000"/>
-          <w:sz w:val="24"/>
-          <w:szCs w:val="24"/>
-          <w:shd w:fill="auto" w:val="clear"/>
-          <w:vertAlign w:val="baseline"/>
-          <w:rtl w:val="0"/>
-        </w:rPr>
-        <w:t xml:space="preserve">Faul, F., Erdfelder, E., Buchner, A., &amp; Lang, A.-G. (2009). Statistical power analyses using G*Power 3.1: Tests for correlation and regression analyses. Behavior Research Methods, 41(4), 1149–1160. https://doi.org/10.3758/BRM.41.4.1149</w:t>
-      </w:r>
-      <w:r>
-        <w:rPr>
-          <w:rtl w:val="0"/>
-        </w:rPr>
-      </w:r>
-    </w:p>
-    <w:p>
-      <w:pPr>
-        <w:spacing w:after="200" w:line="276" w:lineRule="auto"/>
-        <w:jc w:val="both"/>
-        <w:rPr>
-          <w:rFonts w:ascii="Times New Roman" w:cs="Times New Roman" w:eastAsia="Times New Roman" w:hAnsi="Times New Roman"/>
-          <w:sz w:val="24"/>
-          <w:szCs w:val="24"/>
-        </w:rPr>
-      </w:pPr>
-      <w:r>
-        <w:rPr>
-          <w:rFonts w:ascii="Times New Roman" w:cs="Times New Roman" w:eastAsia="Times New Roman" w:hAnsi="Times New Roman"/>
-          <w:b w:val="0"/>
-          <w:bCs w:val="0"/>
-          <w:i w:val="0"/>
-          <w:iCs w:val="0"/>
-          <w:color w:val="000000"/>
-          <w:sz w:val="24"/>
-          <w:szCs w:val="24"/>
-          <w:shd w:fill="auto" w:val="clear"/>
-          <w:vertAlign w:val="baseline"/>
-          <w:rtl w:val="0"/>
-        </w:rPr>
-        <w:t xml:space="preserve">Hamdan, A. (2008). Cognitive restructuring: An Islamic perspective. Journal of Muslim Mental Health, 3(1), 99–116. https://doi.org/10.1080/15564900802035268</w:t>
-      </w:r>
-      <w:r>
-        <w:rPr>
-          <w:rtl w:val="0"/>
-        </w:rPr>
-      </w:r>
-    </w:p>
-    <w:p>
-      <w:pPr>
-        <w:spacing w:after="200" w:line="276" w:lineRule="auto"/>
-        <w:jc w:val="both"/>
-        <w:rPr>
-          <w:rFonts w:ascii="Times New Roman" w:cs="Times New Roman" w:eastAsia="Times New Roman" w:hAnsi="Times New Roman"/>
-          <w:sz w:val="24"/>
-          <w:szCs w:val="24"/>
-        </w:rPr>
-      </w:pPr>
-      <w:r>
-        <w:rPr>
-          <w:rFonts w:ascii="Times New Roman" w:cs="Times New Roman" w:eastAsia="Times New Roman" w:hAnsi="Times New Roman"/>
-          <w:b w:val="0"/>
-          <w:bCs w:val="0"/>
-          <w:i w:val="0"/>
-          <w:iCs w:val="0"/>
-          <w:color w:val="000000"/>
-          <w:sz w:val="24"/>
-          <w:szCs w:val="24"/>
-          <w:shd w:fill="auto" w:val="clear"/>
-          <w:vertAlign w:val="baseline"/>
-          <w:rtl w:val="0"/>
-        </w:rPr>
-        <w:t xml:space="preserve">Hayes, A. F. (2018). Introduction to mediation, moderation, and conditional process analysis: A regression-based approach (2nd ed.). Guilford Press.</w:t>
-      </w:r>
-      <w:r>
-        <w:rPr>
-          <w:rtl w:val="0"/>
-        </w:rPr>
-      </w:r>
-    </w:p>
-    <w:p>
-      <w:pPr>
-        <w:spacing w:after="200" w:line="276" w:lineRule="auto"/>
-        <w:jc w:val="both"/>
-        <w:rPr>
-          <w:rFonts w:ascii="Times New Roman" w:cs="Times New Roman" w:eastAsia="Times New Roman" w:hAnsi="Times New Roman"/>
-          <w:sz w:val="24"/>
-          <w:szCs w:val="24"/>
-        </w:rPr>
-      </w:pPr>
-      <w:r>
-        <w:rPr>
-          <w:rFonts w:ascii="Times New Roman" w:cs="Times New Roman" w:eastAsia="Times New Roman" w:hAnsi="Times New Roman"/>
-          <w:b w:val="0"/>
-          <w:bCs w:val="0"/>
-          <w:i w:val="0"/>
-          <w:iCs w:val="0"/>
-          <w:color w:val="000000"/>
-          <w:sz w:val="24"/>
-          <w:szCs w:val="24"/>
-          <w:shd w:fill="auto" w:val="clear"/>
-          <w:vertAlign w:val="baseline"/>
-          <w:rtl w:val="0"/>
-        </w:rPr>
-        <w:t xml:space="preserve">Scheier, M. F., &amp; Carver, C. S. (1985). Optimism, coping, and health: Assessment and implications of generalized outcome expectancies. Health Psychology, 4(3), 219–247. https://doi.org/10.1037/0278-6133.4.3.219</w:t>
-      </w:r>
-      <w:r>
-        <w:rPr>
-          <w:rtl w:val="0"/>
-        </w:rPr>
-      </w:r>
-    </w:p>
-    <w:p>
-      <w:pPr>
-        <w:spacing w:after="200" w:line="276" w:lineRule="auto"/>
-        <w:jc w:val="both"/>
-        <w:rPr>
-          <w:rFonts w:ascii="Times New Roman" w:cs="Times New Roman" w:eastAsia="Times New Roman" w:hAnsi="Times New Roman"/>
-          <w:sz w:val="24"/>
-          <w:szCs w:val="24"/>
-        </w:rPr>
-      </w:pPr>
-      <w:r>
-        <w:rPr>
-          <w:rFonts w:ascii="Times New Roman" w:cs="Times New Roman" w:eastAsia="Times New Roman" w:hAnsi="Times New Roman"/>
-          <w:b w:val="0"/>
-          <w:bCs w:val="0"/>
-          <w:i w:val="0"/>
-          <w:iCs w:val="0"/>
-          <w:color w:val="000000"/>
-          <w:sz w:val="24"/>
-          <w:szCs w:val="24"/>
-          <w:shd w:fill="auto" w:val="clear"/>
-          <w:vertAlign w:val="baseline"/>
-          <w:rtl w:val="0"/>
-        </w:rPr>
-        <w:t xml:space="preserve">Scheier, M. F., Carver, C. S., &amp; Bridges, M. W. (1994). Distinguishing optimism from neuroticism (and trait anxiety, self-mastery, and self-esteem): A reevaluation of the Life Orientation Test. Journal of Personality and Social Psychology, 67(6), 1063–1078. https://doi.org/10.1037/0022-3514.67.6.1063</w:t>
-      </w:r>
-      <w:r>
-        <w:rPr>
-          <w:rtl w:val="0"/>
-        </w:rPr>
-      </w:r>
-    </w:p>
-    <w:p>
-      <w:pPr>
-        <w:spacing w:after="200" w:line="276" w:lineRule="auto"/>
-        <w:jc w:val="both"/>
-        <w:rPr>
-          <w:rFonts w:ascii="Times New Roman" w:cs="Times New Roman" w:eastAsia="Times New Roman" w:hAnsi="Times New Roman"/>
-          <w:sz w:val="24"/>
-          <w:szCs w:val="24"/>
-        </w:rPr>
-      </w:pPr>
-      <w:r>
-        <w:rPr>
-          <w:rFonts w:ascii="Times New Roman" w:cs="Times New Roman" w:eastAsia="Times New Roman" w:hAnsi="Times New Roman"/>
-          <w:b w:val="0"/>
-          <w:bCs w:val="0"/>
-          <w:i w:val="0"/>
-          <w:iCs w:val="0"/>
-          <w:color w:val="000000"/>
-          <w:sz w:val="24"/>
-          <w:szCs w:val="24"/>
-          <w:shd w:fill="auto" w:val="clear"/>
-          <w:vertAlign w:val="baseline"/>
-          <w:rtl w:val="0"/>
-        </w:rPr>
-        <w:t xml:space="preserve">Shadish, W. R., Cook, T. D., &amp; Campbell, D. T. (2002). Experimental and quasi-experimental designs for generalized causal inference. Houghton Mifflin.</w:t>
-      </w:r>
-      <w:r>
-        <w:rPr>
-          <w:rtl w:val="0"/>
-        </w:rPr>
+      <w:r>
+        <w:t xml:space="preserve">Ainsworth, M. D. S. (1978). *Patterns of Attachment*. Hillsdale: Lawrence Erlbaum.</w:t>
+      </w:r>
+    </w:p>
+    <w:p>
+      <w:r>
+        <w:t xml:space="preserve">Al-Ashfahani, A. (2009). *Mufradat Alfazh al-Qur'an*. Beirut: Dar al-Qalam.</w:t>
+      </w:r>
+    </w:p>
+    <w:p>
+      <w:r>
+        <w:t xml:space="preserve">Al-Attas, S. M. N. (2001). *Prolegomena to the Metaphysics of Islam*. Kuala Lumpur: ISTAC.</w:t>
+      </w:r>
+    </w:p>
+    <w:p>
+      <w:r>
+        <w:t xml:space="preserve">Al-Farmawi, A. H. (2005). *Metode Tafsir Maudhu'i*. Jakarta: RajaGrafindo Persada.</w:t>
+      </w:r>
+    </w:p>
+    <w:p>
+      <w:r>
+        <w:t xml:space="preserve">Al-Ghazali, A. H. (2003). *Kimia' al-Sa'adah*. Bandung: Mizan.</w:t>
+      </w:r>
+    </w:p>
+    <w:p>
+      <w:r>
+        <w:t xml:space="preserve">Al-Ghazali, A. H. (2010). *Ihya' Ulum al-Din*. Beirut: Dar al-Ma'rifah.</w:t>
+      </w:r>
+    </w:p>
+    <w:p>
+      <w:r>
+        <w:t xml:space="preserve">Al-Ghazali, M. (2004). *Meneladani Akhlak Nabi: Tafsir Tematik*. Bandung: Mizan.</w:t>
+      </w:r>
+    </w:p>
+    <w:p>
+      <w:r>
+        <w:t xml:space="preserve">Al-Mahdi, A. Z. (2008). *Psikologi Sufi: Tazkiyatun Nafs sebagai Terapi*. Jakarta: Zaman.</w:t>
+      </w:r>
+    </w:p>
+    <w:p>
+      <w:r>
+        <w:t xml:space="preserve">Al-Munajjid, M. S. (2014). *Konsep Tasliyah dalam Al-Qur'an*. Riyadh: Dar al-Wathan.</w:t>
+      </w:r>
+    </w:p>
+    <w:p>
+      <w:r>
+        <w:t xml:space="preserve">Al-Qurtubi, M. (2006). *Al-Jami' li Ahkam al-Qur'an*. Beirut: Mu'assasah al-Risalah.</w:t>
+      </w:r>
+    </w:p>
+    <w:p>
+      <w:r>
+        <w:t xml:space="preserve">Al-Razi, F. (2004). *Mafatih al-Ghaib*. Beirut: Dar al-Fikr.</w:t>
+      </w:r>
+    </w:p>
+    <w:p>
+      <w:r>
+        <w:t xml:space="preserve">Al-Sabuni, M. A. (2003). *Shafwah al-Tafasir*. Beirut: Dar al-Qalam.</w:t>
+      </w:r>
+    </w:p>
+    <w:p>
+      <w:r>
+        <w:t xml:space="preserve">Al-Siba'i, M. (2006). *Tasliyah wa Takwin*. Beirut: Dar al-Wafa'.</w:t>
+      </w:r>
+    </w:p>
+    <w:p>
+      <w:r>
+        <w:t xml:space="preserve">Al-Tabari, M. J. (2000). *Jami' al-Bayan fi Ta'wil al-Qur'an*. Beirut: Mu'assasah al-Risalah.</w:t>
+      </w:r>
+    </w:p>
+    <w:p>
+      <w:r>
+        <w:t xml:space="preserve">Al-Thabathaba'i, M. H. (2003). *Al-Mizan fi Tafsir al-Qur'an*. Beirut: Mu'assasah al-A'lami.</w:t>
+      </w:r>
+    </w:p>
+    <w:p>
+      <w:r>
+        <w:t xml:space="preserve">Al-Zamakhsyari, M. (1998). *Al-Kasyaf 'an Haqa'iq al-Tanzil*. Beirut: Dar al-Kitab al-'Arabi.</w:t>
+      </w:r>
+    </w:p>
+    <w:p>
+      <w:r>
+        <w:t xml:space="preserve">American Psychological Association. (2013). *Diagnostic and Statistical Manual of Mental Disorders* (5th ed.). Washington, DC: APA.</w:t>
+      </w:r>
+    </w:p>
+    <w:p>
+      <w:r>
+        <w:t xml:space="preserve">Ano, G. G., &amp; Vasconcelles, E. B. (2005). "Religious Coping and Psychological Adjustment." *Journal of Clinical Psychology*, 61(4), 461–480.</w:t>
+      </w:r>
+    </w:p>
+    <w:p>
+      <w:r>
+        <w:t xml:space="preserve">Anshari, F. Z. (2010). *Tasawuf dan Psikologi*. Bandung: Pustaka Hidayah.</w:t>
+      </w:r>
+    </w:p>
+    <w:p>
+      <w:r>
+        <w:t xml:space="preserve">Ansyah, M. (2019). *Pengaruh Tadabbur QS Al-Insyirah terhadap Stres Akademik Mahasiswa*.</w:t>
+      </w:r>
+    </w:p>
+    <w:p>
+      <w:r>
+        <w:t xml:space="preserve">Anwar, S. (2015). *Psikologi Shalat*. Yogyakarta: Pustaka Pelajar.</w:t>
+      </w:r>
+    </w:p>
+    <w:p>
+      <w:r>
+        <w:t xml:space="preserve">Arif, M., et al. (2024). "Systematic Literature Review of Islamic Boarding School Education in Indonesia."</w:t>
+      </w:r>
+    </w:p>
+    <w:p>
+      <w:r>
+        <w:t xml:space="preserve">Arnett, J. J. (2015). *The Oxford Handbook of Emerging Adulthood*. Oxford: Oxford University Press.</w:t>
+      </w:r>
+    </w:p>
+    <w:p>
+      <w:r>
+        <w:t xml:space="preserve">As-Sa'di, A. R. (2002). *Taysir al-Karim al-Rahman fi Tafsir Kalam al-Mannan*. Riyadh: Dar al-Salam.</w:t>
+      </w:r>
+    </w:p>
+    <w:p>
+      <w:r>
+        <w:t xml:space="preserve">Azhar, M. Z., &amp; Varma, S. L. (1995). "Religious Psychotherapy as Management of Bereavement." *Acta Psychiatrica Scandinavica*, 91(4), 233–235.</w:t>
+      </w:r>
+    </w:p>
+    <w:p>
+      <w:r>
+        <w:t xml:space="preserve">Azwar, S. (2015). *Penyusunan Skala Psikologi* (2nd ed.). Yogyakarta: Pustaka Pelajar.</w:t>
+      </w:r>
+    </w:p>
+    <w:p>
+      <w:r>
+        <w:t xml:space="preserve">Azwar, S. (2017). *Reliabilitas dan Validitas* (4th ed.). Yogyakarta: Pustaka Pelajar.</w:t>
+      </w:r>
+    </w:p>
+    <w:p>
+      <w:r>
+        <w:t xml:space="preserve">Badri, M. (2001). *The Dilemma of Muslim Psychologists*. Jakarta: Pustaka Firdaus.</w:t>
+      </w:r>
+    </w:p>
+    <w:p>
+      <w:r>
+        <w:t xml:space="preserve">Baharuddin. (2007). *Paradigma Psikologi Islami*. Yogyakarta: Pustaka Pelajar.</w:t>
+      </w:r>
+    </w:p>
+    <w:p>
+      <w:r>
+        <w:t xml:space="preserve">Baidan, N. (2011). *Metodologi Penafsiran al-Qur'an*. Yogyakarta: Pustaka Pelajar.</w:t>
+      </w:r>
+    </w:p>
+    <w:p>
+      <w:r>
+        <w:t xml:space="preserve">Bastaman, H. D. (2007). *Logoterapi: Psikologi untuk Menemukan Makna Hidup*. Jakarta: RajaGrafindo Persada.</w:t>
+      </w:r>
+    </w:p>
+    <w:p>
+      <w:r>
+        <w:t xml:space="preserve">Beard, C., Weisberg, R. B., &amp; Primack, J. (2012). "Socially Anxious Primary Care Patients' Attitudes Toward Cognitive Bias Modification." *Journal of Anxiety Disorders*, 26(2), 306–313.</w:t>
+      </w:r>
+    </w:p>
+    <w:p>
+      <w:r>
+        <w:t xml:space="preserve">Beck, A. T. (1976). *Cognitive Therapy and the Emotional Disorders*. New York: International Universities Press.</w:t>
+      </w:r>
+    </w:p>
+    <w:p>
+      <w:r>
+        <w:t xml:space="preserve">Beck, A. T. (2011). *Cognitive Therapy: Basics and Beyond* (2nd ed.). New York: Guilford Press.</w:t>
+      </w:r>
+    </w:p>
+    <w:p>
+      <w:r>
+        <w:t xml:space="preserve">Beck, A. T., Rush, A. J., Shaw, B. F., &amp; Emery, G. (1979). *Cognitive Therapy of Depression*. New York: Guilford Press.</w:t>
+      </w:r>
+    </w:p>
+    <w:p>
+      <w:r>
+        <w:t xml:space="preserve">Beck, J. S. (2005). *Cognitive Therapy for Challenging Problems*. New York: Guilford Press.</w:t>
+      </w:r>
+    </w:p>
+    <w:p>
+      <w:r>
+        <w:t xml:space="preserve">Bowlby, J. (1969). *Attachment and Loss* (Vol. 1). New York: Basic Books.</w:t>
+      </w:r>
+    </w:p>
+    <w:p>
+      <w:r>
+        <w:t xml:space="preserve">Carver, C. S., &amp; Scheier, M. F. (2014). "Dispositional Optimism." *Trends in Cognitive Sciences*, 18(6), 293–299.</w:t>
+      </w:r>
+    </w:p>
+    <w:p>
+      <w:r>
+        <w:t xml:space="preserve">Carver, C. S., Scheier, M. F., &amp; Segerstrom, S. C. (2010). "Optimism." *Clinical Psychology Review*, 30(7), 879–889.</w:t>
+      </w:r>
+    </w:p>
+    <w:p>
+      <w:r>
+        <w:t xml:space="preserve">Chodijah, S. (2018). "Tadabbur Ayat Al-Qur'an sebagai Intervensi Psikologis: Sebuah Systematic Review." *Jurnal Psikologi Islam*, 5(1), 25–42.</w:t>
+      </w:r>
+    </w:p>
+    <w:p>
+      <w:r>
+        <w:t xml:space="preserve">Clark, D. A., &amp; Beck, A. T. (2010). *Cognitive Therapy of Anxiety Disorders*. New York: Guilford Press.</w:t>
+      </w:r>
+    </w:p>
+    <w:p>
+      <w:r>
+        <w:t xml:space="preserve">Cohen, J. (1988). *Statistical Power Analysis for the Behavioral Sciences* (2nd ed.). Hillsdale: Lawrence Erlbaum.</w:t>
+      </w:r>
+    </w:p>
+    <w:p>
+      <w:r>
+        <w:t xml:space="preserve">Creed, T. A., Reisweber, J., &amp; Beck, A. T. (2011). *Cognitive Therapy for Adolescents*. New York: Guilford Press.</w:t>
+      </w:r>
+    </w:p>
+    <w:p>
+      <w:r>
+        <w:t xml:space="preserve">Creswell, J. W., &amp; Creswell, J. D. (2018). *Research Design: Qualitative, Quantitative, and Mixed Methods Approaches* (5th ed.). Thousand Oaks: SAGE.</w:t>
+      </w:r>
+    </w:p>
+    <w:p>
+      <w:r>
+        <w:t xml:space="preserve">Daradjat, Z. (2005). *Islam dan Kesehatan Mental*. Jakarta: Gunung Agung.</w:t>
+      </w:r>
+    </w:p>
+    <w:p>
+      <w:r>
+        <w:t xml:space="preserve">Daradjat, Z. (2006). *Peran Agama dalam Kesehatan Mental*. Jakarta: Haji Masagung.</w:t>
+      </w:r>
+    </w:p>
+    <w:p>
+      <w:r>
+        <w:t xml:space="preserve">Diener, E. (2000). "Subjective Well-Being: The Science of Happiness and a Proposal for a National Index." *American Psychologist*, 55(1), 34–43.</w:t>
+      </w:r>
+    </w:p>
+    <w:p>
+      <w:r>
+        <w:t xml:space="preserve">Diener, E., Emmons, R. A., Larsen, R. J., &amp; Griffin, S. (1985). "The Satisfaction with Life Scale." *Journal of Personality Assessment*, 49(1), 71–75.</w:t>
+      </w:r>
+    </w:p>
+    <w:p>
+      <w:r>
+        <w:t xml:space="preserve">Dobson, D., &amp; Dobson, K. S. (2018). *Evidence-Based Practice of Cognitive-Behavioral Therapy* (2nd ed.). New York: Guilford Press.</w:t>
+      </w:r>
+    </w:p>
+    <w:p>
+      <w:r>
+        <w:t xml:space="preserve">Eisenberger, R. (1992). "Learned Industriousness." *Psychological Review*, 99(2), 248–267.</w:t>
+      </w:r>
+    </w:p>
+    <w:p>
+      <w:r>
+        <w:t xml:space="preserve">El-Azayem, A. (1999). *Tazkiyat al-Nafs wa Tarbiyat al-Dhamir*. Beirut: Dar al-Hadi.</w:t>
+      </w:r>
+    </w:p>
+    <w:p>
+      <w:r>
+        <w:t xml:space="preserve">Ellis, A. (1962). *Reason and Emotion in Psychotherapy*. New York: Lyle Stuart.</w:t>
+      </w:r>
+    </w:p>
+    <w:p>
+      <w:r>
+        <w:t xml:space="preserve">Ellis, A. (1994). *Reason and Emotion in Psychotherapy* (Rev. ed.). New York: Birch Lane Press.</w:t>
+      </w:r>
+    </w:p>
+    <w:p>
+      <w:r>
+        <w:t xml:space="preserve">Emmons, R. A., &amp; McCullough, M. E. (2003). "Counting Blessings Versus Burdens." *Journal of Personality and Social Psychology*, 84(2), 377–389.</w:t>
+      </w:r>
+    </w:p>
+    <w:p>
+      <w:r>
+        <w:t xml:space="preserve">Erikson, E. H. (1968). *Identity: Youth and Crisis*. New York: Norton.</w:t>
+      </w:r>
+    </w:p>
+    <w:p>
+      <w:r>
+        <w:t xml:space="preserve">Faul, F., Erdfelder, E., Buchner, A., &amp; Lang, A. G. (2009). "Statistical Power Analyses Using G*Power 3.1." *Behavior Research Methods*, 41(4), 1149–1160.</w:t>
+      </w:r>
+    </w:p>
+    <w:p>
+      <w:r>
+        <w:t xml:space="preserve">Field, A. (2018). *Discovering Statistics Using IBM SPSS Statistics* (5th ed.). London: SAGE.</w:t>
+      </w:r>
+    </w:p>
+    <w:p>
+      <w:r>
+        <w:t xml:space="preserve">Fitri, A., &amp; Kurniawan, I. N. (2021). "Restrukturisasi Kognitif Islami untuk Meningkatkan Optimisme Santri." *Jurnal Psikologi*, 48(2), 89–104.</w:t>
+      </w:r>
+    </w:p>
+    <w:p>
+      <w:r>
+        <w:t xml:space="preserve">Folkman, S. (2010). "Stress, Coping, and Hope." *Psycho-Oncology*, 19(9), 901–908.</w:t>
+      </w:r>
+    </w:p>
+    <w:p>
+      <w:r>
+        <w:t xml:space="preserve">Fredrickson, B. L. (2001). "The Role of Positive Emotions in Positive Psychology." *American Psychologist*, 56(3), 218–226.</w:t>
+      </w:r>
+    </w:p>
+    <w:p>
+      <w:r>
+        <w:t xml:space="preserve">Fredrickson, B. L. (2013). *Positivity*. New York: Crown.</w:t>
+      </w:r>
+    </w:p>
+    <w:p>
+      <w:r>
+        <w:t xml:space="preserve">Friedberg, R. D., &amp; McClure, J. M. (2015). *Clinical Practice of Cognitive Therapy with Children and Adolescents* (2nd ed.). New York: Guilford Press.</w:t>
+      </w:r>
+    </w:p>
+    <w:p>
+      <w:r>
+        <w:t xml:space="preserve">Granqvist, P., &amp; Kirkpatrick, L. A. (2008). "Attachment and Religious Representations." *Journal of Personality*, 76(3), 635–686.</w:t>
+      </w:r>
+    </w:p>
+    <w:p>
+      <w:r>
+        <w:t xml:space="preserve">Greenberger, D., &amp; Padesky, C. A. (2016). *Mind Over Mood* (2nd ed.). New York: Guilford Press.</w:t>
+      </w:r>
+    </w:p>
+    <w:p>
+      <w:r>
+        <w:t xml:space="preserve">Gross, J. J. (2015). "Emotion Regulation: Current Status and Future Prospects." *Psychological Inquiry*, 26(1), 1–26.</w:t>
+      </w:r>
+    </w:p>
+    <w:p>
+      <w:r>
+        <w:t xml:space="preserve">Hamka. (2015). *Tafsir al-Azhar*. Jakarta: Gema Insani.</w:t>
+      </w:r>
+    </w:p>
+    <w:p>
+      <w:r>
+        <w:t xml:space="preserve">Hanifah, L., &amp; Latifah, M. (2018). "Efektivitas Tadabbur Al-Qur'an dalam Meningkatkan Self-Esteem Remaja Panti Asuhan." *Jurnal Psikologi Islam*, 5(1), 1–16.</w:t>
+      </w:r>
+    </w:p>
+    <w:p>
+      <w:r>
+        <w:t xml:space="preserve">Hawwa, S. (2004). *Tazkiyatun Nafs: Konsep Pendidikan Jiwa*. Jakarta: Pena Pundi Aksara.</w:t>
+      </w:r>
+    </w:p>
+    <w:p>
+      <w:r>
+        <w:t xml:space="preserve">Hayes, A. F. (2013). *Introduction to Mediation, Moderation, and Conditional Process Analysis*. New York: Guilford Press.</w:t>
+      </w:r>
+    </w:p>
+    <w:p>
+      <w:r>
+        <w:t xml:space="preserve">Hayes, A. F. (2018). *Introduction to Mediation, Moderation, and Conditional Process Analysis* (2nd ed.). New York: Guilford Press.</w:t>
+      </w:r>
+    </w:p>
+    <w:p>
+      <w:r>
+        <w:t xml:space="preserve">Hayes, S. C., &amp; Hofmann, S. G. (Eds.). (2018). *Process-Based CBT: The Science and Core Clinical Competencies*. Oakland: Context Press.</w:t>
+      </w:r>
+    </w:p>
+    <w:p>
+      <w:r>
+        <w:t xml:space="preserve">Hidayati, F. (2017). "Intervensi Psikospiritual Berbasis Al-Qur'an untuk Menurunkan Depresi pada Remaja." *Jurnal Intervensi Psikologi*, 9(2), 123–142.</w:t>
+      </w:r>
+    </w:p>
+    <w:p>
+      <w:r>
+        <w:t xml:space="preserve">Hikam, M. A. (2023). "Pengaruh Tadabbur Ayat-Ayat Al-Qur'an tentang Amanat dengan Perilaku Tanggung Jawab dan Kedisiplinan."</w:t>
+      </w:r>
+    </w:p>
+    <w:p>
+      <w:r>
+        <w:t xml:space="preserve">Hodge, D. R. (2006). "Spiritually Modified Cognitive Therapy: A Review of the Literature." *Social Work*, 51(2), 157–166.</w:t>
+      </w:r>
+    </w:p>
+    <w:p>
+      <w:r>
+        <w:t xml:space="preserve">Hofmann, S. G. (2011). *An Introduction to Modern CBT*. Chichester: Wiley-Blackwell.</w:t>
+      </w:r>
+    </w:p>
+    <w:p>
+      <w:r>
+        <w:t xml:space="preserve">Husain, A. (2014). *Psikologi Sufistik*. Bandung: Pustaka Hidayah.</w:t>
+      </w:r>
+    </w:p>
+    <w:p>
+      <w:r>
+        <w:t xml:space="preserve">Ibn 'Ashur, M. T. (1984). *Al-Tahrir wa al-Tanwir*. Tunis: Dar al-Tunisiyyah.</w:t>
+      </w:r>
+    </w:p>
+    <w:p>
+      <w:r>
+        <w:t xml:space="preserve">Ibn Kathir, I. (1999). *Tafsir al-Qur'an al-'Azhim*. Riyadh: Dar al-Salam.</w:t>
+      </w:r>
+    </w:p>
+    <w:p>
+      <w:r>
+        <w:t xml:space="preserve">Ibn Qayyim al-Jawziyyah. (2005). *Zad al-Ma'ad fi Hadyi Khayr al-'Ibad*. Beirut: Dar al-Fikr.</w:t>
+      </w:r>
+    </w:p>
+    <w:p>
+      <w:r>
+        <w:t xml:space="preserve">Ibn Qayyim al-Jawziyyah. (2013). *Madarij al-Salikin*. Beirut: Dar al-Kitab al-'Arabi.</w:t>
+      </w:r>
+    </w:p>
+    <w:p>
+      <w:r>
+        <w:t xml:space="preserve">Ibn Sina. (2000). *Al-Qanun fi al-Thibb*. Beirut: Dar al-Sadir.</w:t>
+      </w:r>
+    </w:p>
+    <w:p>
+      <w:r>
+        <w:t xml:space="preserve">Inzlicht, M., et al. (2009). "The Neural Correlates of Religious Experience." *Social Cognitive and Affective Neuroscience*, 4(2), 177–185.</w:t>
+      </w:r>
+    </w:p>
+    <w:p>
+      <w:r>
+        <w:t xml:space="preserve">Jalaluddin. (2012). *Psikologi Agama*. Jakarta: RajaGrafindo Persada.</w:t>
+      </w:r>
+    </w:p>
+    <w:p>
+      <w:r>
+        <w:t xml:space="preserve">Jazayeri, R. S. (2013). *Religious Cognitive Behavioral Therapy: Intervention Manual*. Tehran: University of Social Welfare.</w:t>
+      </w:r>
+    </w:p>
+    <w:p>
+      <w:r>
+        <w:t xml:space="preserve">Kasali, R. (2018). *Metode Penelitian Eksperimen*. Jakarta: Gramedia.</w:t>
+      </w:r>
+    </w:p>
+    <w:p>
+      <w:r>
+        <w:t xml:space="preserve">Kendall, P. C. (Ed.). (2012). *Child and Adolescent Therapy: Cognitive-Behavioral Procedures* (4th ed.). New York: Guilford Press.</w:t>
+      </w:r>
+    </w:p>
+    <w:p>
+      <w:r>
+        <w:t xml:space="preserve">Knapp, P., &amp; Beck, A. T. (2008). "Cognitive Therapy: Foundations, Conceptual Models, Applications and Research." *Revista Brasileira de Psiquiatria*, 30(Suppl II), S54–S64.</w:t>
+      </w:r>
+    </w:p>
+    <w:p>
+      <w:r>
+        <w:t xml:space="preserve">Layous, K., &amp; Lyubomirsky, S. (2014). "The How, Why, What, When, and Who of Happiness." In J. Gruber &amp; J. T. Moskowitz (Eds.), *Positive Emotion* (pp. 473–495). Oxford University Press.</w:t>
+      </w:r>
+    </w:p>
+    <w:p>
+      <w:r>
+        <w:t xml:space="preserve">Lazarus, R. S., &amp; Folkman, S. (1984). *Stress, Appraisal, and Coping*. New York: Springer.</w:t>
+      </w:r>
+    </w:p>
+    <w:p>
+      <w:r>
+        <w:t xml:space="preserve">Lerner, R. M., &amp; Steinberg, L. (Eds.). (2009). *Handbook of Adolescent Psychology* (3rd ed.). Hoboken: Wiley.</w:t>
+      </w:r>
+    </w:p>
+    <w:p>
+      <w:r>
+        <w:t xml:space="preserve">Lestari, P., &amp; Rahayu, M. S. (2019). "Program Tadabbur Al-Qur'an sebagai Upaya Peningkatan Kesejahteraan Psikologis Remaja." *Gadjah Mada Journal of Professional Psychology*, 5(1), 31–48.</w:t>
+      </w:r>
+    </w:p>
+    <w:p>
+      <w:r>
+        <w:t xml:space="preserve">Lyubomirsky, S. (2007). *The How of Happiness*. New York: Penguin.</w:t>
+      </w:r>
+    </w:p>
+    <w:p>
+      <w:r>
+        <w:t xml:space="preserve">Lyubomirsky, S., King, L., &amp; Diener, E. (2005). "The Benefits of Frequent Positive Affect." *Psychological Bulletin*, 131(6), 803–855.</w:t>
+      </w:r>
+    </w:p>
+    <w:p>
+      <w:r>
+        <w:t xml:space="preserve">MacKinnon, D. P. (2008). *Introduction to Statistical Mediation Analysis*. New York: Lawrence Erlbaum.</w:t>
+      </w:r>
+    </w:p>
+    <w:p>
+      <w:r>
+        <w:t xml:space="preserve">Mahmud, R., &amp; Agustin, R. W. (2020). "Tadabbur Al-Qur'an dan Psychological Well-Being pada Santri." *Psikologika*, 25(1), 55–72.</w:t>
+      </w:r>
+    </w:p>
+    <w:p>
+      <w:r>
+        <w:t xml:space="preserve">Marcia, J. E. (1966). "Development and Validation of Ego-Identity Status." *Journal of Personality and Social Psychology*, 3(5), 551–558.</w:t>
+      </w:r>
+    </w:p>
+    <w:p>
+      <w:r>
+        <w:t xml:space="preserve">Masten, A. S. (2014). *Ordinary Magic: Resilience in Development*. New York: Guilford Press.</w:t>
+      </w:r>
+    </w:p>
+    <w:p>
+      <w:r>
+        <w:t xml:space="preserve">Moulaei, N., et al. (2023). "Quran-Based Therapy for Anxiety: A Systematic Review." *Journal of Religion and Health*, 62(4), 2451–2473.</w:t>
+      </w:r>
+    </w:p>
+    <w:p>
+      <w:r>
+        <w:t xml:space="preserve">Mujib, A. (2006). *Kepribadian dalam Psikologi Islam*. Jakarta: RajaGrafindo Persada.</w:t>
+      </w:r>
+    </w:p>
+    <w:p>
+      <w:r>
+        <w:t xml:space="preserve">Naeem, F., &amp; Kingdon, D. (2012). *Cognitive Behaviour Therapy in Non-Western Cultures*. New York: Nova Science.</w:t>
+      </w:r>
+    </w:p>
+    <w:p>
+      <w:r>
+        <w:t xml:space="preserve">Najati, M. U. (2002). *Al-Qur'an dan Ilmu Jiwa*. Bandung: Pustaka.</w:t>
+      </w:r>
+    </w:p>
+    <w:p>
+      <w:r>
+        <w:t xml:space="preserve">Najati, M. U. (2005). *Psikologi dalam Al-Qur'an: Terapi Qur'ani dalam Penyembuhan Gangguan Jiwa*. Bandung: Pustaka Setia.</w:t>
+      </w:r>
+    </w:p>
+    <w:p>
+      <w:r>
+        <w:t xml:space="preserve">Nashori, F. (2008). *Psikologi Sosial Islami*. Bandung: Refika Aditama.</w:t>
+      </w:r>
+    </w:p>
+    <w:p>
+      <w:r>
+        <w:t xml:space="preserve">Nata, A. (2003). *Konsep Manusia dalam Al-Qur'an*. Jakarta: RajaGrafindo Persada.</w:t>
+      </w:r>
+    </w:p>
+    <w:p>
+      <w:r>
+        <w:t xml:space="preserve">Neuman, W. L. (2014). *Social Research Methods: Qualitative and Quantitative Approaches* (7th ed.). Boston: Pearson.</w:t>
+      </w:r>
+    </w:p>
+    <w:p>
+      <w:r>
+        <w:t xml:space="preserve">Newberg, A. B., et al. (2014). "Meditation and the Brain." *Annals of the New York Academy of Sciences*, 1307(1), 88–96.</w:t>
+      </w:r>
+    </w:p>
+    <w:p>
+      <w:r>
+        <w:t xml:space="preserve">Pallant, J. (2020). *SPSS Survival Manual* (7th ed.). London: Open University Press.</w:t>
+      </w:r>
+    </w:p>
+    <w:p>
+      <w:r>
+        <w:t xml:space="preserve">Papalia, D. E., &amp; Martorell, G. (2021). *Experience Human Development* (14th ed.). New York: McGraw-Hill.</w:t>
+      </w:r>
+    </w:p>
+    <w:p>
+      <w:r>
+        <w:t xml:space="preserve">Pargament, K. I. (2007). *Spiritually Integrated Psychotherapy*. New York: Guilford Press.</w:t>
+      </w:r>
+    </w:p>
+    <w:p>
+      <w:r>
+        <w:t xml:space="preserve">Pargament, K. I., Koenig, H. G., &amp; Perez, L. M. (2000). "The Many Methods of Religious Coping." *Journal of Clinical Psychology*, 56(4), 519–543.</w:t>
+      </w:r>
+    </w:p>
+    <w:p>
+      <w:r>
+        <w:t xml:space="preserve">Post, S. G. (2005). "Altruism, Happiness, and Health." *Mental Health, Religion &amp; Culture*, 8(1), 1–16.</w:t>
+      </w:r>
+    </w:p>
+    <w:p>
+      <w:r>
+        <w:t xml:space="preserve">Preacher, K. J., &amp; Hayes, A. F. (2008). "Asymptotic and Resampling Strategies for Assessing and Comparing Indirect Effects." *Behavior Research Methods*, 40(3), 879–891.</w:t>
+      </w:r>
+    </w:p>
+    <w:p>
+      <w:r>
+        <w:t xml:space="preserve">Purwakania Hasan, A. (2006). *Psikologi Perkembangan Islami*. Jakarta: RajaGrafindo Persada.</w:t>
+      </w:r>
+    </w:p>
+    <w:p>
+      <w:r>
+        <w:t xml:space="preserve">Quraish Shihab, M. (1996). *Wawasan al-Qur'an: Tafsir Maudhu'i atas Pelbagai Persoalan Umat*. Bandung: Mizan.</w:t>
+      </w:r>
+    </w:p>
+    <w:p>
+      <w:r>
+        <w:t xml:space="preserve">Rakhmat, J. (2005). *Psikologi Agama: Sebuah Pengantar*. Bandung: Mizan.</w:t>
+      </w:r>
+    </w:p>
+    <w:p>
+      <w:r>
+        <w:t xml:space="preserve">Ramayulis. (2010). *Psikologi Agama*. Jakarta: Kalam Mulia.</w:t>
+      </w:r>
+    </w:p>
+    <w:p>
+      <w:r>
+        <w:t xml:space="preserve">Razali, S. M., Aminah, K., &amp; Khan, U. A. (2002). "Religious-Cognitive Therapy in the Treatment of Anxiety Disorders." *European Journal of Psychiatry*, 16(3), 147–157.</w:t>
+      </w:r>
+    </w:p>
+    <w:p>
+      <w:r>
+        <w:t xml:space="preserve">Rosyidah, N., &amp; Nashori, F. (2019). "Pengaruh Terapi Tadabbur Al-Qur'an terhadap Optimisme Mahasiswa." *Jurnal Psikologi Islam*, 6(2), 89–104.</w:t>
+      </w:r>
+    </w:p>
+    <w:p>
+      <w:r>
+        <w:t xml:space="preserve">Ryff, C. D. (1989). "Happiness Is Everything, or Is It? Explorations on the Meaning of Psychological Well-Being." *Journal of Personality and Social Psychology*, 57(6), 1069–1081.</w:t>
+      </w:r>
+    </w:p>
+    <w:p>
+      <w:r>
+        <w:t xml:space="preserve">Ryff, C. D. (2014). "Psychological Well-Being Revisited: Advances in the Science and Practice of Eudaimonia." *Psychotherapy and Psychosomatics*, 83(1), 10–28.</w:t>
+      </w:r>
+    </w:p>
+    <w:p>
+      <w:r>
+        <w:t xml:space="preserve">Ryff, C. D., &amp; Keyes, C. L. M. (1995). "The Structure of Psychological Well-Being Revisited." *Journal of Personality and Social Psychology*, 69(4), 719–727.</w:t>
+      </w:r>
+    </w:p>
+    <w:p>
+      <w:r>
+        <w:t xml:space="preserve">Ryff, C. D., &amp; Singer, B. H. (2008). "Know Thyself and Become What You Are: A Eudaimonic Approach to Psychological Well-Being." *Journal of Happiness Studies*, 9(1), 13–39.</w:t>
+      </w:r>
+    </w:p>
+    <w:p>
+      <w:r>
+        <w:t xml:space="preserve">Safaria, T. (2013). "The Role of Islamic Cognitive Restructuring on Academic Stress and Psychological Well-Being." *International Journal of Research Studies in Psychology*, 2(2), 41–52.</w:t>
+      </w:r>
+    </w:p>
+    <w:p>
+      <w:r>
+        <w:t xml:space="preserve">Santrock, J. W. (2019). *Adolescence* (17th ed.). New York: McGraw-Hill.</w:t>
+      </w:r>
+    </w:p>
+    <w:p>
+      <w:r>
+        <w:t xml:space="preserve">Scheier, M. F., &amp; Carver, C. S. (1985). "Optimism, Coping, and Health: Assessment and Implications of Generalized Outcome Expectancies." *Health Psychology*, 4(3), 219–247.</w:t>
+      </w:r>
+    </w:p>
+    <w:p>
+      <w:r>
+        <w:t xml:space="preserve">Scheier, M. F., Carver, C. S., &amp; Bridges, M. W. (1994). "Distinguishing Optimism from Neuroticism." *Journal of Personality and Social Psychology*, 67(6), 1063–1078.</w:t>
+      </w:r>
+    </w:p>
+    <w:p>
+      <w:r>
+        <w:t xml:space="preserve">Seligman, M. E. P. (1991). *Learned Optimism*. New York: Knopf.</w:t>
+      </w:r>
+    </w:p>
+    <w:p>
+      <w:r>
+        <w:t xml:space="preserve">Seligman, M. E. P. (2002). *Authentic Happiness*. New York: Free Press.</w:t>
+      </w:r>
+    </w:p>
+    <w:p>
+      <w:r>
+        <w:t xml:space="preserve">Seligman, M. E. P. (2011). *Flourish: A Visionary New Understanding of Happiness and Well-Being*. New York: Free Press.</w:t>
+      </w:r>
+    </w:p>
+    <w:p>
+      <w:r>
+        <w:t xml:space="preserve">Seligman, M. E. P., &amp; Csikszentmihalyi, M. (2000). "Positive Psychology: An Introduction." *American Psychologist*, 55(1), 5–14.</w:t>
+      </w:r>
+    </w:p>
+    <w:p>
+      <w:r>
+        <w:t xml:space="preserve">Shadish, W. R., Cook, T. D., &amp; Campbell, D. T. (2002). *Experimental and Quasi-Experimental Designs*. Boston: Houghton Mifflin.</w:t>
+      </w:r>
+    </w:p>
+    <w:p>
+      <w:r>
+        <w:t xml:space="preserve">Shihab, M. Q. (2002). *Tafsir al-Mishbah: Pesan, Kesan, dan Keserasian al-Qur'an*. Jakarta: Lentera Hati.</w:t>
+      </w:r>
+    </w:p>
+    <w:p>
+      <w:r>
+        <w:t xml:space="preserve">Snyder, C. R. (2002). "Hope Theory: Rainbows in the Mind." *Psychological Inquiry*, 13(4), 249–275.</w:t>
+      </w:r>
+    </w:p>
+    <w:p>
+      <w:r>
+        <w:t xml:space="preserve">Snyder, C. R., Rand, K. L., &amp; Sigmon, D. R. (2018). "Hope Theory: A Member of the Positive Psychology Family." In C. R. Snyder &amp; S. J. Lopez (Eds.), *Handbook of Positive Psychology* (pp. 257–276). Oxford: Oxford University Press.</w:t>
+      </w:r>
+    </w:p>
+    <w:p>
+      <w:r>
+        <w:t xml:space="preserve">Steinberg, L. (2017). *Adolescence* (11th ed.). New York: McGraw-Hill.</w:t>
+      </w:r>
+    </w:p>
+    <w:p>
+      <w:r>
+        <w:t xml:space="preserve">Subandi. (2009). *Psikologi Agama dan Kesehatan Mental*. Yogyakarta: Pustaka Pelajar.</w:t>
+      </w:r>
+    </w:p>
+    <w:p>
+      <w:r>
+        <w:t xml:space="preserve">Sugiyono. (2017). *Metode Penelitian Kuantitatif, Kualitatif, dan R&amp;D*. Bandung: Alfabeta.</w:t>
+      </w:r>
+    </w:p>
+    <w:p>
+      <w:r>
+        <w:t xml:space="preserve">Suryadi, A. (2020). "Efektivitas Tadabbur Al-Qur'an terhadap Penurunan Kecemasan pada Remaja Pondok Pesantren." *Jurnal Psikologi dan Kesehatan Mental*, 4(2), 112–128.</w:t>
+      </w:r>
+    </w:p>
+    <w:p>
+      <w:r>
+        <w:t xml:space="preserve">Tabachnick, B. G., &amp; Fidell, L. S. (2019). *Using Multivariate Statistics* (7th ed.). Boston: Pearson.</w:t>
+      </w:r>
+    </w:p>
+    <w:p>
+      <w:r>
+        <w:t xml:space="preserve">Tedeschi, R. G., &amp; Calhoun, L. G. (1996). "The Posttraumatic Growth Inventory." *Journal of Traumatic Stress*, 9(3), 455–471.</w:t>
+      </w:r>
+    </w:p>
+    <w:p>
+      <w:r>
+        <w:t xml:space="preserve">Thohari, A. (2012). *Psikoterapi Islam*. Yogyakarta: UIN Sunan Kalijaga Press.</w:t>
+      </w:r>
+    </w:p>
+    <w:p>
+      <w:r>
+        <w:t xml:space="preserve">Wahbah al-Zuhayli. (2005). *Tafsir al-Munir*. Beirut: Dar al-Fikr.</w:t>
+      </w:r>
+    </w:p>
+    <w:p>
+      <w:r>
+        <w:t xml:space="preserve">Worthington, E. L., &amp; Aten, J. D. (2009). "Psychotherapy and Religious Values." *Journal of Contemporary Psychotherapy*, 39(1), 1–8.</w:t>
       </w:r>
     </w:p>
     <w:p>

</xml_diff>